<commit_message>
fix: finalize Aurora photographer and customer login branding
Finalize Aurora Fotoportal authentication and login branding.

- Use Aurora Admin Logo URL as authoritative Aurora branding
- Add dedicated photographer login desktop/mobile backgrounds
- Add dedicated customer login desktop/mobile backgrounds
- Add responsive Aurora photographer authentication shell
- Add branded customer portal authentication shell
- Prioritize photographer/studio branding for customer login
- Add Aurora fallback branding
- Improve customer login glass transparency
- Apply Aurora typography to photographer login
- Preserve separate Admin, Photographer and Photo Client auth contexts
- Update Blueprint and changelog

Version: 0.7.1-dev.31-fix40
</commit_message>
<xml_diff>
--- a/docs/Aurora-Fotoportal-Blueprint.docx
+++ b/docs/Aurora-Fotoportal-Blueprint.docx
@@ -89,14 +89,15 @@
             </w:tcMar>
           </w:tcPr>
           <w:p>
-            <w:r/>
+            <w:r>
+              <w:t>0.7.1-dev.31-fix38</w:t>
+            </w:r>
             <w:r>
               <w:rPr>
                 <w:rFonts w:ascii="Aptos" w:hAnsi="Aptos"/>
                 <w:b w:val="0"/>
                 <w:sz w:val="18"/>
               </w:rPr>
-              <w:t>0.7.1-dev.31-fix20</w:t>
             </w:r>
           </w:p>
         </w:tc>
@@ -7768,12 +7769,12 @@
               </w:rPr>
               <w:t>Ny fast regel</w:t>
               <w:br/>
+              <w:t>Fra og med 0.7.1-dev.31-fix38 skal hver Aurora Fotoportal ZIP inneholde oppdatert docs/Aurora-Fotoportal-Blueprint.docx. Blueprinten skal oppdateres når arkitektur, funksjoner, dataflyt, sikkerhet, statusmodell eller roadmap endres. Tekniske ADR-er og Markdown-changelog beholdes parallelt.</w:t>
             </w:r>
             <w:r>
               <w:rPr>
                 <w:sz w:val="19"/>
               </w:rPr>
-              <w:t>Fra og med 0.7.1-dev.31-fix20 skal hver Aurora Fotoportal ZIP inneholde oppdatert docs/Aurora-Fotoportal-Blueprint.docx. Blueprinten skal oppdateres når arkitektur, funksjoner, dataflyt, sikkerhet, statusmodell eller roadmap endres. Tekniske ADR-er og Markdown-changelog beholdes parallelt.</w:t>
             </w:r>
           </w:p>
         </w:tc>
@@ -8240,8 +8241,287 @@
         <w:t>After successful Aurora Photographer authentication, the application redirects internally to Photographer Workspace. Direct Workspace links are still valid for an existing authenticated session, but they are not sent as the login link in onboarding email.</w:t>
       </w:r>
     </w:p>
+    <w:p>
+      <w:r>
+        <w:br w:type="page"/>
+      </w:r>
+    </w:p>
+    <w:p>
+      <w:r>
+        <w:rPr>
+          <w:b/>
+          <w:sz w:val="36"/>
+        </w:rPr>
+        <w:t>Release Update · 0.7.1-dev.31-fix38</w:t>
+      </w:r>
+    </w:p>
+    <w:p>
+      <w:r>
+        <w:rPr>
+          <w:b/>
+        </w:rPr>
+        <w:t>Central login branding and customer authentication presentation</w:t>
+      </w:r>
+    </w:p>
+    <w:p>
+      <w:r>
+        <w:t>Denne oppdateringen samler styringen av innloggingsbranding under Aurora Admin → Branding og viderefører den etablerte separasjonen mellom WordPress/Aurora Admin, Aurora Photographer og Aurora Photo Client.</w:t>
+      </w:r>
+    </w:p>
+    <w:p>
+      <w:pPr>
+        <w:pStyle w:val="ListBullet"/>
+      </w:pPr>
+      <w:r>
+        <w:t>Fotografinnlogging bruker nå Logo URL fra Aurora Admin som autoritativ Aurora-logo. Dersom feltet er tomt brukes tidligere innebygget/generert Aurora-identitet som fallback.</w:t>
+      </w:r>
+    </w:p>
+    <w:p>
+      <w:pPr>
+        <w:pStyle w:val="ListBullet"/>
+      </w:pPr>
+      <w:r>
+        <w:t>Aurora Admin har egne opplastingsfelt for fotokunde-login: desktop/PC og mobil.</w:t>
+      </w:r>
+    </w:p>
+    <w:p>
+      <w:pPr>
+        <w:pStyle w:val="ListBullet"/>
+      </w:pPr>
+      <w:r>
+        <w:t>Kundens mobilbakgrunn faller tilbake til kundens desktop-bakgrunn, deretter fotograf-loginens bakgrunn dersom egne kundebilder ikke er konfigurert.</w:t>
+      </w:r>
+    </w:p>
+    <w:p>
+      <w:pPr>
+        <w:pStyle w:val="ListBullet"/>
+      </w:pPr>
+      <w:r>
+        <w:t>Fotokunde-login og passordflater bruker en egen fullskjerms, responsiv glass-style auth shell.</w:t>
+      </w:r>
+    </w:p>
+    <w:p>
+      <w:pPr>
+        <w:pStyle w:val="ListBullet"/>
+      </w:pPr>
+      <w:r>
+        <w:t>På kundevendte innloggingsflater prioriteres fotografens/studioets egen logo. Aurora-logo brukes som fallback dersom fotografen ikke har konfigurert logo.</w:t>
+      </w:r>
+    </w:p>
+    <w:p>
+      <w:pPr>
+        <w:pStyle w:val="ListBullet"/>
+      </w:pPr>
+      <w:r>
+        <w:t>Bakgrunnsbilder for fotokunde-login er plattformeierstyrt. Fotografen kan ikke endre disse i Photographer Workspace i denne versjonen.</w:t>
+      </w:r>
+    </w:p>
+    <w:p>
+      <w:pPr>
+        <w:pStyle w:val="ListBullet"/>
+      </w:pPr>
+      <w:r>
+        <w:t>Ingen endring i autentiseringsgrensene: kundelogin bruker fortsatt kundeautorisasjon og tenant/account_id; fotograf-login bruker separat Aurora Photographer-auth.</w:t>
+      </w:r>
+    </w:p>
+    <w:p>
+      <w:r>
+        <w:rPr>
+          <w:b/>
+        </w:rPr>
+        <w:t>Admin-felter</w:t>
+      </w:r>
+    </w:p>
+    <w:p>
+      <w:pPr>
+        <w:pStyle w:val="ListBullet"/>
+      </w:pPr>
+      <w:r>
+        <w:t>Fotograf-login bakgrunn – desktop / PC</w:t>
+      </w:r>
+    </w:p>
+    <w:p>
+      <w:pPr>
+        <w:pStyle w:val="ListBullet"/>
+      </w:pPr>
+      <w:r>
+        <w:t>Fotograf-login bakgrunn – mobil</w:t>
+      </w:r>
+    </w:p>
+    <w:p>
+      <w:pPr>
+        <w:pStyle w:val="ListBullet"/>
+      </w:pPr>
+      <w:r>
+        <w:t>Fotokunde-login bakgrunn – desktop / PC</w:t>
+      </w:r>
+    </w:p>
+    <w:p>
+      <w:pPr>
+        <w:pStyle w:val="ListBullet"/>
+      </w:pPr>
+      <w:r>
+        <w:t>Fotokunde-login bakgrunn – mobil</w:t>
+      </w:r>
+    </w:p>
+    <w:p>
+      <w:pPr>
+        <w:pStyle w:val="ListBullet"/>
+      </w:pPr>
+      <w:r>
+        <w:t>Logo URL – brukes som sentral Aurora-logo på fotograf-auth og som fallback på kundelogin.</w:t>
+      </w:r>
+    </w:p>
+    <w:p>
+      <w:r>
+        <w:rPr>
+          <w:b/>
+        </w:rPr>
+        <w:t>Fallback-policy</w:t>
+      </w:r>
+    </w:p>
+    <w:p>
+      <w:r>
+        <w:t>Fotograf-logo: Aurora Admin Logo URL → innebygget Aurora-identitet. Fotokunde-logo: fotograf/studio-logo → Aurora Admin Logo URL. Fotokunde-bakgrunn mobil: kundemobil → kundedesktop → fotografmobil → fotografdesktop.</w:t>
+      </w:r>
+    </w:p>
+    <w:p>
+      <w:r>
+        <w:br w:type="page"/>
+      </w:r>
+    </w:p>
+    <w:p>
+      <w:r>
+        <w:rPr>
+          <w:b/>
+          <w:sz w:val="36"/>
+        </w:rPr>
+        <w:t>Release Update · 0.7.1-dev.31-fix39</w:t>
+      </w:r>
+    </w:p>
+    <w:p>
+      <w:r>
+        <w:rPr>
+          <w:b/>
+        </w:rPr>
+        <w:t>Login brand lockup and customer glass refinement</w:t>
+      </w:r>
+    </w:p>
+    <w:p>
+      <w:r>
+        <w:t>Denne oppdateringen finjusterer de to innloggingsflatene uten å endre autentiseringsarkitekturen.</w:t>
+      </w:r>
+    </w:p>
+    <w:p>
+      <w:pPr>
+        <w:pStyle w:val="ListBullet"/>
+      </w:pPr>
+      <w:r>
+        <w:t>Fotografinnloggingen bruker fortsatt Logo URL fra Aurora Admin som autoritativt logo-symbol.</w:t>
+      </w:r>
+    </w:p>
+    <w:p>
+      <w:pPr>
+        <w:pStyle w:val="ListBullet"/>
+      </w:pPr>
+      <w:r>
+        <w:t>AURORA-navnet og teksten «Intelligent Business Platform» rendres nå alltid sammen med logo-symbolet, slik at den komplette Aurora-identiteten vises på fotografinnlogging og aktiveringsflater.</w:t>
+      </w:r>
+    </w:p>
+    <w:p>
+      <w:pPr>
+        <w:pStyle w:val="ListBullet"/>
+      </w:pPr>
+      <w:r>
+        <w:t>Hvis Logo URL ikke er konfigurert, brukes innebygget Aurora-symbol som fallback, mens AURORA-navn og plattformtekst fortsatt vises.</w:t>
+      </w:r>
+    </w:p>
+    <w:p>
+      <w:pPr>
+        <w:pStyle w:val="ListBullet"/>
+      </w:pPr>
+      <w:r>
+        <w:t>Innloggingskortet i fotokundeportalen er gjort mer transparent og bruker sterkere backdrop-blur. Bakgrunnsbildet blir dermed tydeligere synlig uten å redusere lesbarheten i skjemaet.</w:t>
+      </w:r>
+    </w:p>
+    <w:p>
+      <w:pPr>
+        <w:pStyle w:val="ListBullet"/>
+      </w:pPr>
+      <w:r>
+        <w:t>Fotokunde-branding fortsetter å prioritere fotografens/studioets logo, med Aurora-logo som fallback.</w:t>
+      </w:r>
+    </w:p>
+    <w:p>
+      <w:r>
+        <w:br w:type="page"/>
+      </w:r>
+    </w:p>
+    <w:p>
+      <w:r>
+        <w:rPr>
+          <w:b/>
+          <w:sz w:val="36"/>
+        </w:rPr>
+        <w:t>Release Update · 0.7.1-dev.31-fix40</w:t>
+      </w:r>
+    </w:p>
+    <w:p>
+      <w:r>
+        <w:rPr>
+          <w:b/>
+        </w:rPr>
+        <w:t>Aurora photographer-login typography lock</w:t>
+      </w:r>
+    </w:p>
+    <w:p>
+      <w:r>
+        <w:t>Denne oppdateringen låser den etablerte Aurora-wordmark-typografien på fotografens autentiseringsflater. Ingen autentiseringsflyt, tenant-logikk eller kundelogin er endret.</w:t>
+      </w:r>
+    </w:p>
+    <w:p>
+      <w:pPr>
+        <w:pStyle w:val="ListBullet"/>
+      </w:pPr>
+      <w:r>
+        <w:t>AURORA-wordmark bruker Montserrat Light (300).</w:t>
+      </w:r>
+    </w:p>
+    <w:p>
+      <w:pPr>
+        <w:pStyle w:val="ListBullet"/>
+      </w:pPr>
+      <w:r>
+        <w:t>Letter-spacing er satt til 0.30em innenfor den avtalte Aurora-standarden 0.28–0.35em.</w:t>
+      </w:r>
+    </w:p>
+    <w:p>
+      <w:pPr>
+        <w:pStyle w:val="ListBullet"/>
+      </w:pPr>
+      <w:r>
+        <w:t>Montserrat 300 lastes eksplisitt i den dedikerte photographer-auth shell, med sikker sans-serif fallback.</w:t>
+      </w:r>
+    </w:p>
+    <w:p>
+      <w:pPr>
+        <w:pStyle w:val="ListBullet"/>
+      </w:pPr>
+      <w:r>
+        <w:t>Logo URL fra Aurora Admin forblir autoritativt logo-symbol over AURORA-wordmark.</w:t>
+      </w:r>
+    </w:p>
+    <w:p>
+      <w:pPr>
+        <w:pStyle w:val="ListBullet"/>
+      </w:pPr>
+      <w:r>
+        <w:t>Fix39 sin kundeportal-transparens og login-branding beholdes uendret.</w:t>
+      </w:r>
+    </w:p>
     <w:sectPr>
       <w:footerReference w:type="default" r:id="rId9"/>
+      <w:headerReference w:type="default" r:id="rId10"/>
       <w:pgSz w:w="12240" w:h="15840"/>
       <w:pgMar w:top="936" w:right="1037" w:bottom="936" w:left="1037" w:header="720" w:footer="720" w:gutter="0"/>
       <w:cols w:space="720"/>
@@ -8259,14 +8539,20 @@
       <w:jc w:val="center"/>
     </w:pPr>
     <w:r>
-      <w:rPr>
-        <w:color w:val="6E6E78"/>
-        <w:sz w:val="16"/>
-      </w:rPr>
-      <w:t>Aurora Fotoportal · Blueprint baseline 0.7.1-dev.31-fix20 · 9Ls1 Digital</w:t>
+      <w:t>Aurora Fotoportal · Blueprint baseline 0.7.1-dev.31-fix40 · 9Ls1 Digital</w:t>
     </w:r>
   </w:p>
 </w:ftr>
+</file>
+
+<file path=word/header1.xml><?xml version="1.0" encoding="utf-8"?>
+<w:hdr xmlns:m="http://schemas.openxmlformats.org/officeDocument/2006/math" xmlns:mc="http://schemas.openxmlformats.org/markup-compatibility/2006" xmlns:mo="http://schemas.microsoft.com/office/mac/office/2008/main" xmlns:mv="urn:schemas-microsoft-com:mac:vml" xmlns:o="urn:schemas-microsoft-com:office:office" xmlns:r="http://schemas.openxmlformats.org/officeDocument/2006/relationships" xmlns:v="urn:schemas-microsoft-com:vml" xmlns:w10="urn:schemas-microsoft-com:office:word" xmlns:w14="http://schemas.microsoft.com/office/word/2010/wordml" xmlns:w="http://schemas.openxmlformats.org/wordprocessingml/2006/main" xmlns:wne="http://schemas.microsoft.com/office/word/2006/wordml" xmlns:wp14="http://schemas.microsoft.com/office/word/2010/wordprocessingDrawing" xmlns:wp="http://schemas.openxmlformats.org/drawingml/2006/wordprocessingDrawing" xmlns:wpc="http://schemas.microsoft.com/office/word/2010/wordprocessingCanvas" xmlns:wpg="http://schemas.microsoft.com/office/word/2010/wordprocessingGroup" xmlns:wpi="http://schemas.microsoft.com/office/word/2010/wordprocessingInk" xmlns:wps="http://schemas.microsoft.com/office/word/2010/wordprocessingShape" mc:Ignorable="w14 wp14">
+  <w:p>
+    <w:pPr>
+      <w:pStyle w:val="Header"/>
+    </w:pPr>
+  </w:p>
+</w:hdr>
 </file>
 
 <file path=word/numbering.xml><?xml version="1.0" encoding="utf-8"?>

</xml_diff>

<commit_message>
feat: add photographer account management
Add Aurora photographer/studio account management foundation.

- Add photographer and studio customer directory
- Add search, filtering and sorting
- Add detailed photographer account cards
- Add organization number and website
- Add contact person, phone and account email
- Add complete billing information
- Add account status and plan overview
- Add license information
- Add created and last-active tracking
- Add internal Aurora Admin notes
- Preserve existing trial, invitation and module controls
- Add account schema migration
- Update Aurora Fotoportal Blueprint and changelog

Version: 0.7.1-dev.32-account1
</commit_message>
<xml_diff>
--- a/docs/Aurora-Fotoportal-Blueprint.docx
+++ b/docs/Aurora-Fotoportal-Blueprint.docx
@@ -8519,6 +8519,102 @@
         <w:t>Fix39 sin kundeportal-transparens og login-branding beholdes uendret.</w:t>
       </w:r>
     </w:p>
+    <w:p>
+      <w:r>
+        <w:br w:type="page"/>
+      </w:r>
+    </w:p>
+    <w:p>
+      <w:r>
+        <w:rPr>
+          <w:b/>
+          <w:sz w:val="36"/>
+        </w:rPr>
+        <w:t>Release Update · 0.7.1-dev.32-account1</w:t>
+      </w:r>
+    </w:p>
+    <w:p>
+      <w:r>
+        <w:rPr>
+          <w:b/>
+        </w:rPr>
+        <w:t>Photographer Account Management · foundation</w:t>
+      </w:r>
+    </w:p>
+    <w:p>
+      <w:r>
+        <w:t>Denne utviklingsblokken etablerer Aurora Admin sitt fotograf-/studiokundekartotek som plattformeierens administrative hovedregister. Kontoopplysninger tilhører Aurora Account/tenant-laget og skal ikke ligge som spredt WordPress user-meta.</w:t>
+      </w:r>
+    </w:p>
+    <w:p>
+      <w:pPr>
+        <w:pStyle w:val="ListBullet"/>
+      </w:pPr>
+      <w:r>
+        <w:t>Aurora Account schema v0.5.0 utvider fotografkontoen med organisasjonsnummer, kontakttelefon, nettside, fakturanavn, fakturaadresse, postnummer, sted, land, faktura-e-post, interne adminnotater og last_active_at.</w:t>
+      </w:r>
+    </w:p>
+    <w:p>
+      <w:pPr>
+        <w:pStyle w:val="ListBullet"/>
+      </w:pPr>
+      <w:r>
+        <w:t>Aurora Admin → Fotografkontoer har søk på studio, kontaktperson, e-post, telefon, organisasjonsnummer og faktura-e-post.</w:t>
+      </w:r>
+    </w:p>
+    <w:p>
+      <w:pPr>
+        <w:pStyle w:val="ListBullet"/>
+      </w:pPr>
+      <w:r>
+        <w:t>Kundekartoteket kan filtreres på kontostatus og sorteres på navn, opprettet, sist oppdatert, sist aktiv og status.</w:t>
+      </w:r>
+    </w:p>
+    <w:p>
+      <w:pPr>
+        <w:pStyle w:val="ListBullet"/>
+      </w:pPr>
+      <w:r>
+        <w:t>Fotograf-/studiokortet samler firmaopplysninger, kontakt/innlogging, fakturainformasjon, interne notater, plan/lisens, Trial-status, invitasjon og modultilgang.</w:t>
+      </w:r>
+    </w:p>
+    <w:p>
+      <w:pPr>
+        <w:pStyle w:val="ListBullet"/>
+      </w:pPr>
+      <w:r>
+        <w:t>Konto-/login-e-post er fortsatt autoritativt styrt av Aurora Admin. Ved adminendring forsøkes e-post på koblet photographer-owner-bruker synkronisert når adressen ikke allerede er i bruk.</w:t>
+      </w:r>
+    </w:p>
+    <w:p>
+      <w:pPr>
+        <w:pStyle w:val="ListBullet"/>
+      </w:pPr>
+      <w:r>
+        <w:t>Sist aktiv oppdateres ved vellykket Aurora Photographer Login og ved videreføring av en allerede autentisert photographer-session.</w:t>
+      </w:r>
+    </w:p>
+    <w:p>
+      <w:pPr>
+        <w:pStyle w:val="ListBullet"/>
+      </w:pPr>
+      <w:r>
+        <w:t>Eksisterende Trial-, invitation- og module-policy videreføres uendret. Support access er neste del av samme feature-branch og skal bygges som eksplisitt, logget og tidsbegrenset adgang uten deling av fotografens passord.</w:t>
+      </w:r>
+    </w:p>
+    <w:p>
+      <w:r>
+        <w:rPr>
+          <w:b/>
+        </w:rPr>
+        <w:t>Neste fase</w:t>
+      </w:r>
+    </w:p>
+    <w:p>
+      <w:r>
+        <w:t>Sikker supporttilgang fra Aurora Admin til en fotografkonto, basert på fotografens eksplisitte samtykke, tidsbegrenset impersonation/support-session og revisjonslogg. Deretter følger sentralt Master Template-bibliotek og ny PDF-generator som separate utviklingsblokker.</w:t>
+      </w:r>
+    </w:p>
     <w:sectPr>
       <w:footerReference w:type="default" r:id="rId9"/>
       <w:headerReference w:type="default" r:id="rId10"/>
@@ -8539,7 +8635,7 @@
       <w:jc w:val="center"/>
     </w:pPr>
     <w:r>
-      <w:t>Aurora Fotoportal · Blueprint baseline 0.7.1-dev.31-fix40 · 9Ls1 Digital</w:t>
+      <w:t>Aurora Fotoportal · Blueprint baseline 0.7.1-dev.32-account1 · 9Ls1 Digital</w:t>
     </w:r>
   </w:p>
 </w:ftr>

</xml_diff>

<commit_message>
feat: add secure photographer support access
Add consent-based Aurora support access for photographer accounts.

- Add photographer-controlled support access setting
- Add secure Aurora Admin support sessions
- Lock support sessions to photographer account_id
- Add 60-minute support session lifetime
- Add visible support mode banner
- Add explicit exit from support mode
- Prevent use or exposure of photographer passwords
- Add support access audit logging
- Add support history to photographer account card
- Add support consent and revocation logging
- Upgrade photographer account schema to 0.6.0
- Update Blueprint, changelog and ADR-035

Version: 0.7.1-dev.32-account2
</commit_message>
<xml_diff>
--- a/docs/Aurora-Fotoportal-Blueprint.docx
+++ b/docs/Aurora-Fotoportal-Blueprint.docx
@@ -8615,6 +8615,110 @@
         <w:t>Sikker supporttilgang fra Aurora Admin til en fotografkonto, basert på fotografens eksplisitte samtykke, tidsbegrenset impersonation/support-session og revisjonslogg. Deretter følger sentralt Master Template-bibliotek og ny PDF-generator som separate utviklingsblokker.</w:t>
       </w:r>
     </w:p>
+    <w:p>
+      <w:r>
+        <w:br w:type="page"/>
+      </w:r>
+    </w:p>
+    <w:p>
+      <w:r>
+        <w:rPr>
+          <w:b/>
+          <w:sz w:val="36"/>
+        </w:rPr>
+        <w:t>Release Update · 0.7.1-dev.32-account2</w:t>
+      </w:r>
+    </w:p>
+    <w:p>
+      <w:r>
+        <w:rPr>
+          <w:b/>
+        </w:rPr>
+        <w:t>Consent-based support access</w:t>
+      </w:r>
+    </w:p>
+    <w:p>
+      <w:r>
+        <w:t>Denne oppdateringen etablerer sikker, eksplisitt og tidsbegrenset supporttilgang fra Aurora Admin til fotografens Photographer Workspace. Løsningen endrer ikke fotografens passord og gir ikke plattformeier permanent tilgang til fotografdata.</w:t>
+      </w:r>
+    </w:p>
+    <w:p>
+      <w:pPr>
+        <w:pStyle w:val="ListBullet"/>
+      </w:pPr>
+      <w:r>
+        <w:t>Fotografen styrer selv supporttilgang under Photographer Workspace → Innstillinger → Support og personvern.</w:t>
+      </w:r>
+    </w:p>
+    <w:p>
+      <w:pPr>
+        <w:pStyle w:val="ListBullet"/>
+      </w:pPr>
+      <w:r>
+        <w:t>Aurora Admin kan kun åpne Workspace når fotografkontoen har support_access_enabled aktivert.</w:t>
+      </w:r>
+    </w:p>
+    <w:p>
+      <w:pPr>
+        <w:pStyle w:val="ListBullet"/>
+      </w:pPr>
+      <w:r>
+        <w:t>En supportøkt varer i 60 minutter, er bundet til den valgte account_id og bruker administratorens eksisterende autentiserte WordPress/Aurora-sesjon. Fotografens passord leses, lagres eller deles aldri.</w:t>
+      </w:r>
+    </w:p>
+    <w:p>
+      <w:pPr>
+        <w:pStyle w:val="ListBullet"/>
+      </w:pPr>
+      <w:r>
+        <w:t>Photographer Workspace viser et tydelig Supportmodus-banner med fotograf-/studionavn og knapp for å avslutte økten.</w:t>
+      </w:r>
+    </w:p>
+    <w:p>
+      <w:pPr>
+        <w:pStyle w:val="ListBullet"/>
+      </w:pPr>
+      <w:r>
+        <w:t>Supportkonteksten avsluttes automatisk ved utløp, dersom fotografen trekker samtykket, eller når administratoren forlater Photographer Workspace til andre adminflater.</w:t>
+      </w:r>
+    </w:p>
+    <w:p>
+      <w:pPr>
+        <w:pStyle w:val="ListBullet"/>
+      </w:pPr>
+      <w:r>
+        <w:t>Aurora Admin-kundekortet viser om support er godkjent, når tilgangen sist ble aktivert, knapp for å starte supportøkt og en kort supportlogg.</w:t>
+      </w:r>
+    </w:p>
+    <w:p>
+      <w:pPr>
+        <w:pStyle w:val="ListBullet"/>
+      </w:pPr>
+      <w:r>
+        <w:t>Supporthendelser logges i en egen plattformtabell: samtykke aktivert/deaktivert, supportøkt startet/avsluttet, avvist forsøk og administrativ revokering.</w:t>
+      </w:r>
+    </w:p>
+    <w:p>
+      <w:pPr>
+        <w:pStyle w:val="ListBullet"/>
+      </w:pPr>
+      <w:r>
+        <w:t>Account schema er oppgradert fra 0.5.0 til 0.6.0 med additive supportfelter og support_logs-tabell.</w:t>
+      </w:r>
+    </w:p>
+    <w:p>
+      <w:r>
+        <w:rPr>
+          <w:b/>
+        </w:rPr>
+        <w:t>Sikkerhetsprinsipp</w:t>
+      </w:r>
+    </w:p>
+    <w:p>
+      <w:r>
+        <w:t>Supporttilgang er samtykkebasert og midlertidig. Den gir Aurora Administrator mulighet til å feilsøke og bistå inne i riktig tenant, men skal ikke brukes som generell plattformeiertilgang til fotografens sluttkundedata. Hver supportøkt må kunne spores til aktør, fotografkonto og tidspunkt.</w:t>
+      </w:r>
+    </w:p>
     <w:sectPr>
       <w:footerReference w:type="default" r:id="rId9"/>
       <w:headerReference w:type="default" r:id="rId10"/>
@@ -8635,7 +8739,7 @@
       <w:jc w:val="center"/>
     </w:pPr>
     <w:r>
-      <w:t>Aurora Fotoportal · Blueprint baseline 0.7.1-dev.32-account1 · 9Ls1 Digital</w:t>
+      <w:t>Aurora Fotoportal · Blueprint baseline 0.7.1-dev.32-account2 · 9Ls1 Digital</w:t>
     </w:r>
   </w:p>
 </w:ftr>

</xml_diff>